<commit_message>
Remove screenshot placeholders from the guide
Drops all "📷 SCREENSHOT PLACEHOLDER" boxes and captions from the docx, the
PDF/HTML, and the Markdown, plus the now-unused screenshot() helper, its CSS,
and the meta note about them. Regenerated PC_Tracker_User_Guide.docx and .pdf.

Co-Authored-By: Claude Opus 4.8 <noreply@anthropic.com>
Claude-Session: https://claude.ai/code/session_0172ZVtpowLAcC8nipj9gZtL
</commit_message>
<xml_diff>
--- a/docs/PC_Tracker_User_Guide.docx
+++ b/docs/PC_Tracker_User_Guide.docx
@@ -225,7 +225,7 @@
             <w:pPr>
               <w:jc w:val="center"/>
             </w:pPr>
-            <w:hyperlink w:history="1" r:id="rIdkvtqnv5wuoxn0nm7qtpa3">
+            <w:hyperlink w:history="1" r:id="rId4vb1yauvfvrsne8pvzlkf">
               <w:r>
                 <w:rPr>
                   <w:rFonts w:ascii="Calibri" w:cs="Calibri" w:eastAsia="Calibri" w:hAnsi="Calibri"/>
@@ -257,7 +257,7 @@
             <w:pPr>
               <w:jc w:val="center"/>
             </w:pPr>
-            <w:hyperlink w:history="1" r:id="rId_5gror9dmxohmwzfqu4lx">
+            <w:hyperlink w:history="1" r:id="rIduapu13oyewqhmnoodzike">
               <w:r>
                 <w:rPr>
                   <w:rFonts w:ascii="Calibri" w:cs="Calibri" w:eastAsia="Calibri" w:hAnsi="Calibri"/>
@@ -1500,69 +1500,6 @@
       <w:tblPr>
         <w:tblW w:type="pct" w:w="100%"/>
         <w:tblBorders>
-          <w:top w:val="dashed" w:color="94A3B8" w:sz="6"/>
-          <w:left w:val="dashed" w:color="94A3B8" w:sz="6"/>
-          <w:bottom w:val="dashed" w:color="94A3B8" w:sz="6"/>
-          <w:right w:val="dashed" w:color="94A3B8" w:sz="6"/>
-          <w:insideH w:val="none"/>
-          <w:insideV w:val="none"/>
-        </w:tblBorders>
-      </w:tblPr>
-      <w:tblGrid>
-        <w:gridCol w:w="9360"/>
-      </w:tblGrid>
-      <w:tr>
-        <w:tc>
-          <w:tcPr>
-            <w:tcW w:type="dxa" w:w="9360"/>
-            <w:shd w:fill="F1F5F9" w:color="auto" w:val="clear"/>
-            <w:tcMar>
-              <w:top w:type="dxa" w:w="200"/>
-              <w:left w:type="dxa" w:w="160"/>
-              <w:bottom w:type="dxa" w:w="200"/>
-              <w:right w:type="dxa" w:w="160"/>
-            </w:tcMar>
-          </w:tcPr>
-          <w:p>
-            <w:pPr>
-              <w:spacing w:after="40"/>
-              <w:jc w:val="center"/>
-            </w:pPr>
-            <w:r>
-              <w:rPr>
-                <w:rFonts w:ascii="Calibri" w:cs="Calibri" w:eastAsia="Calibri" w:hAnsi="Calibri"/>
-                <w:b/>
-                <w:bCs/>
-                <w:color w:val="64748B"/>
-                <w:sz w:val="20"/>
-                <w:szCs w:val="20"/>
-              </w:rPr>
-              <w:t xml:space="preserve">📷  SCREENSHOT PLACEHOLDER</w:t>
-            </w:r>
-          </w:p>
-          <w:p>
-            <w:pPr>
-              <w:jc w:val="center"/>
-            </w:pPr>
-            <w:r>
-              <w:rPr>
-                <w:rFonts w:ascii="Calibri" w:cs="Calibri" w:eastAsia="Calibri" w:hAnsi="Calibri"/>
-                <w:i/>
-                <w:iCs/>
-                <w:color w:val="64748B"/>
-                <w:sz w:val="19"/>
-                <w:szCs w:val="19"/>
-              </w:rPr>
-              <w:t xml:space="preserve">The 🚀 App Menu open, showing “🚨 Initial Setup (Run Once).”</w:t>
-            </w:r>
-          </w:p>
-        </w:tc>
-      </w:tr>
-    </w:tbl>
-    <w:tbl>
-      <w:tblPr>
-        <w:tblW w:type="pct" w:w="100%"/>
-        <w:tblBorders>
           <w:top w:val="single" w:color="FEF2F2" w:sz="2"/>
           <w:left w:val="single" w:color="B91C1C" w:sz="24"/>
           <w:bottom w:val="single" w:color="FEF2F2" w:sz="2"/>
@@ -1781,69 +1718,6 @@
         <w:t xml:space="preserve"> account.</w:t>
       </w:r>
     </w:p>
-    <w:tbl>
-      <w:tblPr>
-        <w:tblW w:type="pct" w:w="100%"/>
-        <w:tblBorders>
-          <w:top w:val="dashed" w:color="94A3B8" w:sz="6"/>
-          <w:left w:val="dashed" w:color="94A3B8" w:sz="6"/>
-          <w:bottom w:val="dashed" w:color="94A3B8" w:sz="6"/>
-          <w:right w:val="dashed" w:color="94A3B8" w:sz="6"/>
-          <w:insideH w:val="none"/>
-          <w:insideV w:val="none"/>
-        </w:tblBorders>
-      </w:tblPr>
-      <w:tblGrid>
-        <w:gridCol w:w="9360"/>
-      </w:tblGrid>
-      <w:tr>
-        <w:tc>
-          <w:tcPr>
-            <w:tcW w:type="dxa" w:w="9360"/>
-            <w:shd w:fill="F1F5F9" w:color="auto" w:val="clear"/>
-            <w:tcMar>
-              <w:top w:type="dxa" w:w="200"/>
-              <w:left w:type="dxa" w:w="160"/>
-              <w:bottom w:type="dxa" w:w="200"/>
-              <w:right w:type="dxa" w:w="160"/>
-            </w:tcMar>
-          </w:tcPr>
-          <w:p>
-            <w:pPr>
-              <w:spacing w:after="40"/>
-              <w:jc w:val="center"/>
-            </w:pPr>
-            <w:r>
-              <w:rPr>
-                <w:rFonts w:ascii="Calibri" w:cs="Calibri" w:eastAsia="Calibri" w:hAnsi="Calibri"/>
-                <w:b/>
-                <w:bCs/>
-                <w:color w:val="64748B"/>
-                <w:sz w:val="20"/>
-                <w:szCs w:val="20"/>
-              </w:rPr>
-              <w:t xml:space="preserve">📷  SCREENSHOT PLACEHOLDER</w:t>
-            </w:r>
-          </w:p>
-          <w:p>
-            <w:pPr>
-              <w:jc w:val="center"/>
-            </w:pPr>
-            <w:r>
-              <w:rPr>
-                <w:rFonts w:ascii="Calibri" w:cs="Calibri" w:eastAsia="Calibri" w:hAnsi="Calibri"/>
-                <w:i/>
-                <w:iCs/>
-                <w:color w:val="64748B"/>
-                <w:sz w:val="19"/>
-                <w:szCs w:val="19"/>
-              </w:rPr>
-              <w:t xml:space="preserve">The Google consent screen: “Google hasn't verified this app” → Advanced → Go to … (unsafe) → Allow.</w:t>
-            </w:r>
-          </w:p>
-        </w:tc>
-      </w:tr>
-    </w:tbl>
     <w:p>
       <w:pPr>
         <w:pStyle w:val="Heading3"/>
@@ -3021,69 +2895,6 @@
         <w:t xml:space="preserve">.</w:t>
       </w:r>
     </w:p>
-    <w:tbl>
-      <w:tblPr>
-        <w:tblW w:type="pct" w:w="100%"/>
-        <w:tblBorders>
-          <w:top w:val="dashed" w:color="94A3B8" w:sz="6"/>
-          <w:left w:val="dashed" w:color="94A3B8" w:sz="6"/>
-          <w:bottom w:val="dashed" w:color="94A3B8" w:sz="6"/>
-          <w:right w:val="dashed" w:color="94A3B8" w:sz="6"/>
-          <w:insideH w:val="none"/>
-          <w:insideV w:val="none"/>
-        </w:tblBorders>
-      </w:tblPr>
-      <w:tblGrid>
-        <w:gridCol w:w="9360"/>
-      </w:tblGrid>
-      <w:tr>
-        <w:tc>
-          <w:tcPr>
-            <w:tcW w:type="dxa" w:w="9360"/>
-            <w:shd w:fill="F1F5F9" w:color="auto" w:val="clear"/>
-            <w:tcMar>
-              <w:top w:type="dxa" w:w="200"/>
-              <w:left w:type="dxa" w:w="160"/>
-              <w:bottom w:type="dxa" w:w="200"/>
-              <w:right w:type="dxa" w:w="160"/>
-            </w:tcMar>
-          </w:tcPr>
-          <w:p>
-            <w:pPr>
-              <w:spacing w:after="40"/>
-              <w:jc w:val="center"/>
-            </w:pPr>
-            <w:r>
-              <w:rPr>
-                <w:rFonts w:ascii="Calibri" w:cs="Calibri" w:eastAsia="Calibri" w:hAnsi="Calibri"/>
-                <w:b/>
-                <w:bCs/>
-                <w:color w:val="64748B"/>
-                <w:sz w:val="20"/>
-                <w:szCs w:val="20"/>
-              </w:rPr>
-              <w:t xml:space="preserve">📷  SCREENSHOT PLACEHOLDER</w:t>
-            </w:r>
-          </w:p>
-          <w:p>
-            <w:pPr>
-              <w:jc w:val="center"/>
-            </w:pPr>
-            <w:r>
-              <w:rPr>
-                <w:rFonts w:ascii="Calibri" w:cs="Calibri" w:eastAsia="Calibri" w:hAnsi="Calibri"/>
-                <w:i/>
-                <w:iCs/>
-                <w:color w:val="64748B"/>
-                <w:sz w:val="19"/>
-                <w:szCs w:val="19"/>
-              </w:rPr>
-              <w:t xml:space="preserve">The RAW Data tab showing the colored PASTE boxes (Blue A5 / Orange AG6 / Green AP2).</w:t>
-            </w:r>
-          </w:p>
-        </w:tc>
-      </w:tr>
-    </w:tbl>
     <w:p>
       <w:pPr>
         <w:pStyle w:val="Heading3"/>
@@ -6452,69 +6263,6 @@
       <w:tblPr>
         <w:tblW w:type="pct" w:w="100%"/>
         <w:tblBorders>
-          <w:top w:val="dashed" w:color="94A3B8" w:sz="6"/>
-          <w:left w:val="dashed" w:color="94A3B8" w:sz="6"/>
-          <w:bottom w:val="dashed" w:color="94A3B8" w:sz="6"/>
-          <w:right w:val="dashed" w:color="94A3B8" w:sz="6"/>
-          <w:insideH w:val="none"/>
-          <w:insideV w:val="none"/>
-        </w:tblBorders>
-      </w:tblPr>
-      <w:tblGrid>
-        <w:gridCol w:w="9360"/>
-      </w:tblGrid>
-      <w:tr>
-        <w:tc>
-          <w:tcPr>
-            <w:tcW w:type="dxa" w:w="9360"/>
-            <w:shd w:fill="F1F5F9" w:color="auto" w:val="clear"/>
-            <w:tcMar>
-              <w:top w:type="dxa" w:w="200"/>
-              <w:left w:type="dxa" w:w="160"/>
-              <w:bottom w:type="dxa" w:w="200"/>
-              <w:right w:type="dxa" w:w="160"/>
-            </w:tcMar>
-          </w:tcPr>
-          <w:p>
-            <w:pPr>
-              <w:spacing w:after="40"/>
-              <w:jc w:val="center"/>
-            </w:pPr>
-            <w:r>
-              <w:rPr>
-                <w:rFonts w:ascii="Calibri" w:cs="Calibri" w:eastAsia="Calibri" w:hAnsi="Calibri"/>
-                <w:b/>
-                <w:bCs/>
-                <w:color w:val="64748B"/>
-                <w:sz w:val="20"/>
-                <w:szCs w:val="20"/>
-              </w:rPr>
-              <w:t xml:space="preserve">📷  SCREENSHOT PLACEHOLDER</w:t>
-            </w:r>
-          </w:p>
-          <w:p>
-            <w:pPr>
-              <w:jc w:val="center"/>
-            </w:pPr>
-            <w:r>
-              <w:rPr>
-                <w:rFonts w:ascii="Calibri" w:cs="Calibri" w:eastAsia="Calibri" w:hAnsi="Calibri"/>
-                <w:i/>
-                <w:iCs/>
-                <w:color w:val="64748B"/>
-                <w:sz w:val="19"/>
-                <w:szCs w:val="19"/>
-              </w:rPr>
-              <w:t xml:space="preserve">The Contact Log: the pre-call search bar up top and a row being auto-filled by the Ghost Typist.</w:t>
-            </w:r>
-          </w:p>
-        </w:tc>
-      </w:tr>
-    </w:tbl>
-    <w:tbl>
-      <w:tblPr>
-        <w:tblW w:type="pct" w:w="100%"/>
-        <w:tblBorders>
           <w:top w:val="single" w:color="EEF4FF" w:sz="2"/>
           <w:left w:val="single" w:color="1D4ED8" w:sz="24"/>
           <w:bottom w:val="single" w:color="EEF4FF" w:sz="2"/>
@@ -7426,69 +7174,6 @@
       <w:tblPr>
         <w:tblW w:type="pct" w:w="100%"/>
         <w:tblBorders>
-          <w:top w:val="dashed" w:color="94A3B8" w:sz="6"/>
-          <w:left w:val="dashed" w:color="94A3B8" w:sz="6"/>
-          <w:bottom w:val="dashed" w:color="94A3B8" w:sz="6"/>
-          <w:right w:val="dashed" w:color="94A3B8" w:sz="6"/>
-          <w:insideH w:val="none"/>
-          <w:insideV w:val="none"/>
-        </w:tblBorders>
-      </w:tblPr>
-      <w:tblGrid>
-        <w:gridCol w:w="9360"/>
-      </w:tblGrid>
-      <w:tr>
-        <w:tc>
-          <w:tcPr>
-            <w:tcW w:type="dxa" w:w="9360"/>
-            <w:shd w:fill="F1F5F9" w:color="auto" w:val="clear"/>
-            <w:tcMar>
-              <w:top w:type="dxa" w:w="200"/>
-              <w:left w:type="dxa" w:w="160"/>
-              <w:bottom w:type="dxa" w:w="200"/>
-              <w:right w:type="dxa" w:w="160"/>
-            </w:tcMar>
-          </w:tcPr>
-          <w:p>
-            <w:pPr>
-              <w:spacing w:after="40"/>
-              <w:jc w:val="center"/>
-            </w:pPr>
-            <w:r>
-              <w:rPr>
-                <w:rFonts w:ascii="Calibri" w:cs="Calibri" w:eastAsia="Calibri" w:hAnsi="Calibri"/>
-                <w:b/>
-                <w:bCs/>
-                <w:color w:val="64748B"/>
-                <w:sz w:val="20"/>
-                <w:szCs w:val="20"/>
-              </w:rPr>
-              <w:t xml:space="preserve">📷  SCREENSHOT PLACEHOLDER</w:t>
-            </w:r>
-          </w:p>
-          <w:p>
-            <w:pPr>
-              <w:jc w:val="center"/>
-            </w:pPr>
-            <w:r>
-              <w:rPr>
-                <w:rFonts w:ascii="Calibri" w:cs="Calibri" w:eastAsia="Calibri" w:hAnsi="Calibri"/>
-                <w:i/>
-                <w:iCs/>
-                <w:color w:val="64748B"/>
-                <w:sz w:val="19"/>
-                <w:szCs w:val="19"/>
-              </w:rPr>
-              <w:t xml:space="preserve">The ⚙️ Settings dialog with its toggle switches.</w:t>
-            </w:r>
-          </w:p>
-        </w:tc>
-      </w:tr>
-    </w:tbl>
-    <w:tbl>
-      <w:tblPr>
-        <w:tblW w:type="pct" w:w="100%"/>
-        <w:tblBorders>
           <w:top w:val="single" w:color="F0FDF4" w:sz="2"/>
           <w:left w:val="single" w:color="166534" w:sz="24"/>
           <w:bottom w:val="single" w:color="F0FDF4" w:sz="2"/>
@@ -8008,69 +7693,6 @@
       <w:tblPr>
         <w:tblW w:type="pct" w:w="100%"/>
         <w:tblBorders>
-          <w:top w:val="dashed" w:color="94A3B8" w:sz="6"/>
-          <w:left w:val="dashed" w:color="94A3B8" w:sz="6"/>
-          <w:bottom w:val="dashed" w:color="94A3B8" w:sz="6"/>
-          <w:right w:val="dashed" w:color="94A3B8" w:sz="6"/>
-          <w:insideH w:val="none"/>
-          <w:insideV w:val="none"/>
-        </w:tblBorders>
-      </w:tblPr>
-      <w:tblGrid>
-        <w:gridCol w:w="9360"/>
-      </w:tblGrid>
-      <w:tr>
-        <w:tc>
-          <w:tcPr>
-            <w:tcW w:type="dxa" w:w="9360"/>
-            <w:shd w:fill="F1F5F9" w:color="auto" w:val="clear"/>
-            <w:tcMar>
-              <w:top w:type="dxa" w:w="200"/>
-              <w:left w:type="dxa" w:w="160"/>
-              <w:bottom w:type="dxa" w:w="200"/>
-              <w:right w:type="dxa" w:w="160"/>
-            </w:tcMar>
-          </w:tcPr>
-          <w:p>
-            <w:pPr>
-              <w:spacing w:after="40"/>
-              <w:jc w:val="center"/>
-            </w:pPr>
-            <w:r>
-              <w:rPr>
-                <w:rFonts w:ascii="Calibri" w:cs="Calibri" w:eastAsia="Calibri" w:hAnsi="Calibri"/>
-                <w:b/>
-                <w:bCs/>
-                <w:color w:val="64748B"/>
-                <w:sz w:val="20"/>
-                <w:szCs w:val="20"/>
-              </w:rPr>
-              <w:t xml:space="preserve">📷  SCREENSHOT PLACEHOLDER</w:t>
-            </w:r>
-          </w:p>
-          <w:p>
-            <w:pPr>
-              <w:jc w:val="center"/>
-            </w:pPr>
-            <w:r>
-              <w:rPr>
-                <w:rFonts w:ascii="Calibri" w:cs="Calibri" w:eastAsia="Calibri" w:hAnsi="Calibri"/>
-                <w:i/>
-                <w:iCs/>
-                <w:color w:val="64748B"/>
-                <w:sz w:val="19"/>
-                <w:szCs w:val="19"/>
-              </w:rPr>
-              <w:t xml:space="preserve">The System Upgrade Wizard with the old-sheet URL box and the six-step checklist.</w:t>
-            </w:r>
-          </w:p>
-        </w:tc>
-      </w:tr>
-    </w:tbl>
-    <w:tbl>
-      <w:tblPr>
-        <w:tblW w:type="pct" w:w="100%"/>
-        <w:tblBorders>
           <w:top w:val="single" w:color="F0FDF4" w:sz="2"/>
           <w:left w:val="single" w:color="166534" w:sz="24"/>
           <w:bottom w:val="single" w:color="F0FDF4" w:sz="2"/>
@@ -8478,69 +8100,6 @@
         <w:t xml:space="preserve">Hands you the link to next year's fresh, fast template.</w:t>
       </w:r>
     </w:p>
-    <w:tbl>
-      <w:tblPr>
-        <w:tblW w:type="pct" w:w="100%"/>
-        <w:tblBorders>
-          <w:top w:val="dashed" w:color="94A3B8" w:sz="6"/>
-          <w:left w:val="dashed" w:color="94A3B8" w:sz="6"/>
-          <w:bottom w:val="dashed" w:color="94A3B8" w:sz="6"/>
-          <w:right w:val="dashed" w:color="94A3B8" w:sz="6"/>
-          <w:insideH w:val="none"/>
-          <w:insideV w:val="none"/>
-        </w:tblBorders>
-      </w:tblPr>
-      <w:tblGrid>
-        <w:gridCol w:w="9360"/>
-      </w:tblGrid>
-      <w:tr>
-        <w:tc>
-          <w:tcPr>
-            <w:tcW w:type="dxa" w:w="9360"/>
-            <w:shd w:fill="F1F5F9" w:color="auto" w:val="clear"/>
-            <w:tcMar>
-              <w:top w:type="dxa" w:w="200"/>
-              <w:left w:type="dxa" w:w="160"/>
-              <w:bottom w:type="dxa" w:w="200"/>
-              <w:right w:type="dxa" w:w="160"/>
-            </w:tcMar>
-          </w:tcPr>
-          <w:p>
-            <w:pPr>
-              <w:spacing w:after="40"/>
-              <w:jc w:val="center"/>
-            </w:pPr>
-            <w:r>
-              <w:rPr>
-                <w:rFonts w:ascii="Calibri" w:cs="Calibri" w:eastAsia="Calibri" w:hAnsi="Calibri"/>
-                <w:b/>
-                <w:bCs/>
-                <w:color w:val="64748B"/>
-                <w:sz w:val="20"/>
-                <w:szCs w:val="20"/>
-              </w:rPr>
-              <w:t xml:space="preserve">📷  SCREENSHOT PLACEHOLDER</w:t>
-            </w:r>
-          </w:p>
-          <w:p>
-            <w:pPr>
-              <w:jc w:val="center"/>
-            </w:pPr>
-            <w:r>
-              <w:rPr>
-                <w:rFonts w:ascii="Calibri" w:cs="Calibri" w:eastAsia="Calibri" w:hAnsi="Calibri"/>
-                <w:i/>
-                <w:iCs/>
-                <w:color w:val="64748B"/>
-                <w:sz w:val="19"/>
-                <w:szCs w:val="19"/>
-              </w:rPr>
-              <w:t xml:space="preserve">The End of Year Rollover wizard: archive summary and the “Get New Template” button.</w:t>
-            </w:r>
-          </w:p>
-        </w:tc>
-      </w:tr>
-    </w:tbl>
     <w:tbl>
       <w:tblPr>
         <w:tblW w:type="pct" w:w="100%"/>

</xml_diff>